<commit_message>
docs: page de garde (Diarrassouba Awa / Dr Evora Zekpe) et pagination débutant à 97
Co-Authored-By: Devin AI <158243242+devin-ai-integration[bot]@users.noreply.github.com>
</commit_message>
<xml_diff>
--- a/Memoire_Deuxieme_Partie.docx
+++ b/Memoire_Deuxieme_Partie.docx
@@ -59,7 +59,7 @@
         <w:spacing w:before="2400"/>
       </w:pPr>
       <w:r>
-        <w:t>Présenté par : ……………………………………</w:t>
+        <w:t>Présenté par : DIARRASSOUBA AWA</w:t>
       </w:r>
     </w:p>
     <w:p>
@@ -67,7 +67,7 @@
         <w:jc w:val="center"/>
       </w:pPr>
       <w:r>
-        <w:t>Sous la direction de : ……………………………………</w:t>
+        <w:t>Sous la supervision de : Dr EVORA ZEKPE</w:t>
       </w:r>
     </w:p>
     <w:p>
@@ -788,6 +788,7 @@
     <w:sectPr>
       <w:footerReference w:type="default" r:id="rId9"/>
       <w:pgMar w:top="1417" w:bottom="1417" w:left="1701" w:right="1417"/>
+      <w:pgNumType w:start="97"/>
     </w:sectPr>
   </w:body>
 </w:document>

</xml_diff>